<commit_message>
Update Word text file: strapline
</commit_message>
<xml_diff>
--- a/text/intro/strapline.docx
+++ b/text/intro/strapline.docx
@@ -3,6 +3,10 @@
 <w:document xmlns:w="http://schemas.openxmlformats.org/wordprocessingml/2006/main">
   <w:body>
     <w:p>
+      <w:pPr>
+        <w:jc w:val="center"/>
+        <w:spacing w:line="341" w:lineRule="auto"/>
+      </w:pPr>
       <w:r>
         <w:rPr>
           <w:i/>

</xml_diff>